<commit_message>
fix: ajuste template, campos triplicados
</commit_message>
<xml_diff>
--- a/templates/os/os-consultoria-suporte.docx
+++ b/templates/os/os-consultoria-suporte.docx
@@ -694,18 +694,6 @@
               <w:t xml:space="preserve">{{Objetivo}}</w:t>
             </w:r>
           </w:p>
-          <w:p>
-            <w:pPr/>
-            <w:r>
-              <w:t xml:space="preserve">{{Objetivo}}</w:t>
-            </w:r>
-          </w:p>
-          <w:p>
-            <w:pPr/>
-            <w:r>
-              <w:t xml:space="preserve">{{Objetivo}}</w:t>
-            </w:r>
-          </w:p>
         </w:tc>
       </w:tr>
       <w:tr>
@@ -717,7 +705,7 @@
           <w:p>
             <w:pPr/>
             <w:r>
-              <w:t xml:space="preserve">Atividades previstas:</w:t>
+              <w:t xml:space="preserve">Atividades previstas (separe múltiplas com ;):</w:t>
             </w:r>
           </w:p>
           <w:p>
@@ -726,18 +714,6 @@
               <w:t xml:space="preserve">{{Atividades_Previstas}}</w:t>
             </w:r>
           </w:p>
-          <w:p>
-            <w:pPr/>
-            <w:r>
-              <w:t xml:space="preserve">{{Atividades_Previstas}}</w:t>
-            </w:r>
-          </w:p>
-          <w:p>
-            <w:pPr/>
-            <w:r>
-              <w:t xml:space="preserve">{{Atividades_Previstas}}</w:t>
-            </w:r>
-          </w:p>
         </w:tc>
       </w:tr>
       <w:tr>
@@ -750,12 +726,6 @@
             <w:pPr/>
             <w:r>
               <w:t xml:space="preserve">Fora do escopo:</w:t>
-            </w:r>
-          </w:p>
-          <w:p>
-            <w:pPr/>
-            <w:r>
-              <w:t xml:space="preserve">{{Fora_Escopo}}</w:t>
             </w:r>
           </w:p>
           <w:p>
@@ -1327,19 +1297,7 @@
           <w:p>
             <w:pPr/>
             <w:r>
-              <w:t xml:space="preserve"/>
-            </w:r>
-          </w:p>
-          <w:p>
-            <w:pPr/>
-            <w:r>
-              <w:t xml:space="preserve">{{Observacoes}}</w:t>
-            </w:r>
-          </w:p>
-          <w:p>
-            <w:pPr/>
-            <w:r>
-              <w:t xml:space="preserve">{{Observacoes}}</w:t>
+              <w:t xml:space="preserve">Observações (separe múltiplas com ;):</w:t>
             </w:r>
           </w:p>
           <w:p>

</xml_diff>